<commit_message>
Software 2.º Esencial v2: correcciones de la auditoría de ChatGPT (10/10)
Ficha E 687,5 GB; Clase 10 sin redondeo previo; Práctica 20 informe de la
Farmacia Tajy; Práctica 19 con datos propios; Práctica 9 con celda H1;
capacidades en secuencias 18 y 36; Práctica 12 y Clase 19 reformuladas;
excepción de peso documentada; auditoría con matriz trazable y prueba de
reutilización de datos (402 controles, 0 fallos).

Co-Authored-By: Claude Opus 5.5 <noreply@anthropic.com>
Claude-Session: https://claude.ai/code/session_01LqBrALZn8HbnzzUtvCFRMa
</commit_message>
<xml_diff>
--- a/software_2_esencial/salida/Gabinete_Informatica_Software_2do_Curso_PLAN_ANUAL_COMERCIAL_2026.docx
+++ b/software_2_esencial/salida/Gabinete_Informatica_Software_2do_Curso_PLAN_ANUAL_COMERCIAL_2026.docx
@@ -3339,7 +3339,119 @@
                 <w:color w:val="1B4F72"/>
                 <w:sz w:val="16"/>
               </w:rPr>
-              <w:t>Capacidades MEC: las de la Unidad 1, consolidadas en las secuencias 1 a 17.</w:t>
+              <w:t>Capacidad MEC: «Reconoce las principales características de los Gabinetes de computadoras.»</w:t>
+            </w:r>
+          </w:p>
+          <w:p>
+            <w:pPr>
+              <w:spacing w:after="20"/>
+            </w:pPr>
+            <w:r>
+              <w:rPr>
+                <w:b/>
+                <w:i/>
+                <w:color w:val="1B4F72"/>
+                <w:sz w:val="16"/>
+              </w:rPr>
+              <w:t>Capacidad MEC: «Analiza las principales funciones de una fuente de alimentación de computadora.»</w:t>
+            </w:r>
+          </w:p>
+          <w:p>
+            <w:pPr>
+              <w:spacing w:after="20"/>
+            </w:pPr>
+            <w:r>
+              <w:rPr>
+                <w:b/>
+                <w:i/>
+                <w:color w:val="1B4F72"/>
+                <w:sz w:val="16"/>
+              </w:rPr>
+              <w:t>Capacidad MEC: «Identifica los diferentes tipos de Placa Madre utilizados en las computadoras.»</w:t>
+            </w:r>
+          </w:p>
+          <w:p>
+            <w:pPr>
+              <w:spacing w:after="20"/>
+            </w:pPr>
+            <w:r>
+              <w:rPr>
+                <w:b/>
+                <w:i/>
+                <w:color w:val="1B4F72"/>
+                <w:sz w:val="16"/>
+              </w:rPr>
+              <w:t>Capacidad MEC: «Identifica las características principales de los slots de expansión de las placas madres.»</w:t>
+            </w:r>
+          </w:p>
+          <w:p>
+            <w:pPr>
+              <w:spacing w:after="20"/>
+            </w:pPr>
+            <w:r>
+              <w:rPr>
+                <w:b/>
+                <w:i/>
+                <w:color w:val="1B4F72"/>
+                <w:sz w:val="16"/>
+              </w:rPr>
+              <w:t>Capacidad MEC: «Identifica los diferentes puertos de conexión que existen en una computadora.»</w:t>
+            </w:r>
+          </w:p>
+          <w:p>
+            <w:pPr>
+              <w:spacing w:after="20"/>
+            </w:pPr>
+            <w:r>
+              <w:rPr>
+                <w:b/>
+                <w:i/>
+                <w:color w:val="1B4F72"/>
+                <w:sz w:val="16"/>
+              </w:rPr>
+              <w:t>Capacidad MEC: «Reconoce las principales características de los microprocesadores de computadoras.»</w:t>
+            </w:r>
+          </w:p>
+          <w:p>
+            <w:pPr>
+              <w:spacing w:after="20"/>
+            </w:pPr>
+            <w:r>
+              <w:rPr>
+                <w:b/>
+                <w:i/>
+                <w:color w:val="1B4F72"/>
+                <w:sz w:val="16"/>
+              </w:rPr>
+              <w:t>Capacidad MEC: «Identifica los diferentes tipos de memorias utilizados en la computadora.»</w:t>
+            </w:r>
+          </w:p>
+          <w:p>
+            <w:pPr>
+              <w:spacing w:after="20"/>
+            </w:pPr>
+            <w:r>
+              <w:rPr>
+                <w:b/>
+                <w:i/>
+                <w:color w:val="1B4F72"/>
+                <w:sz w:val="16"/>
+              </w:rPr>
+              <w:t>Capacidad MEC: «Reconoce las características de los dispositivos de almacenamiento secundario.»</w:t>
+            </w:r>
+          </w:p>
+          <w:p>
+            <w:pPr>
+              <w:spacing w:after="20"/>
+            </w:pPr>
+            <w:r>
+              <w:rPr>
+                <w:b/>
+                <w:i/>
+                <w:color w:val="1B4F72"/>
+                <w:sz w:val="16"/>
+              </w:rPr>
+              <w:t>Capacidad MEC: «Identifica los diferentes tipos de impresoras.»</w:t>
             </w:r>
           </w:p>
         </w:tc>
@@ -6447,7 +6559,91 @@
                 <w:color w:val="1B4F72"/>
                 <w:sz w:val="16"/>
               </w:rPr>
-              <w:t>Capacidades MEC: las de la Unidad 2, consolidadas en las secuencias 19 a 35.</w:t>
+              <w:t>Capacidad MEC: «Reconoce las características principales de una red de comunicaciones.»</w:t>
+            </w:r>
+          </w:p>
+          <w:p>
+            <w:pPr>
+              <w:spacing w:after="20"/>
+            </w:pPr>
+            <w:r>
+              <w:rPr>
+                <w:b/>
+                <w:i/>
+                <w:color w:val="1B4F72"/>
+                <w:sz w:val="16"/>
+              </w:rPr>
+              <w:t>Capacidad MEC: «Analiza los principios de las redes de comunicación.»</w:t>
+            </w:r>
+          </w:p>
+          <w:p>
+            <w:pPr>
+              <w:spacing w:after="20"/>
+            </w:pPr>
+            <w:r>
+              <w:rPr>
+                <w:b/>
+                <w:i/>
+                <w:color w:val="1B4F72"/>
+                <w:sz w:val="16"/>
+              </w:rPr>
+              <w:t>Capacidad MEC: «Identifica equipos y materiales para una red»</w:t>
+            </w:r>
+          </w:p>
+          <w:p>
+            <w:pPr>
+              <w:spacing w:after="20"/>
+            </w:pPr>
+            <w:r>
+              <w:rPr>
+                <w:b/>
+                <w:i/>
+                <w:color w:val="1B4F72"/>
+                <w:sz w:val="16"/>
+              </w:rPr>
+              <w:t>Capacidad MEC: «Identifica las características principales de los medios de transmisión más utilizados.»</w:t>
+            </w:r>
+          </w:p>
+          <w:p>
+            <w:pPr>
+              <w:spacing w:after="20"/>
+            </w:pPr>
+            <w:r>
+              <w:rPr>
+                <w:b/>
+                <w:i/>
+                <w:color w:val="1B4F72"/>
+                <w:sz w:val="16"/>
+              </w:rPr>
+              <w:t>Capacidad MEC: «Analiza las normas de cableado estructurado utilizadas en la actualidad.»</w:t>
+            </w:r>
+          </w:p>
+          <w:p>
+            <w:pPr>
+              <w:spacing w:after="20"/>
+            </w:pPr>
+            <w:r>
+              <w:rPr>
+                <w:b/>
+                <w:i/>
+                <w:color w:val="1B4F72"/>
+                <w:sz w:val="16"/>
+              </w:rPr>
+              <w:t>Capacidad MEC: «Reconoce los aspectos regulatorios del ente rector en telecomunicaciones en el País.»</w:t>
+            </w:r>
+          </w:p>
+          <w:p>
+            <w:pPr>
+              <w:spacing w:after="20"/>
+            </w:pPr>
+            <w:r>
+              <w:rPr>
+                <w:b/>
+                <w:i/>
+                <w:color w:val="1B4F72"/>
+                <w:sz w:val="16"/>
+              </w:rPr>
+              <w:t>Capacidad MEC: «Reconoce la importancia de la capacidad de abstracción, análisis y síntesis en los trabajos realizados.»</w:t>
             </w:r>
           </w:p>
         </w:tc>

</xml_diff>